<commit_message>
docs: refresh report with updated source code
</commit_message>
<xml_diff>
--- a/BaoCao_Lab01_NguyenHuynhPhuongDong_3124411071.docx
+++ b/BaoCao_Lab01_NguyenHuynhPhuongDong_3124411071.docx
@@ -1168,6 +1168,34 @@
           <w:color w:val="1F1F1F"/>
           <w:sz w:val="15"/>
         </w:rPr>
+        <w:t>using System;</w:t>
+      </w:r>
+    </w:p>
+    <w:p>
+      <w:pPr>
+        <w:pStyle w:val="CodeBlock"/>
+        <w:keepLines/>
+      </w:pPr>
+      <w:r>
+        <w:rPr>
+          <w:rFonts w:ascii="Consolas" w:hAnsi="Consolas" w:eastAsia="Consolas"/>
+          <w:color w:val="1F1F1F"/>
+          <w:sz w:val="15"/>
+        </w:rPr>
+        <w:t xml:space="preserve"> </w:t>
+      </w:r>
+    </w:p>
+    <w:p>
+      <w:pPr>
+        <w:pStyle w:val="CodeBlock"/>
+        <w:keepLines/>
+      </w:pPr>
+      <w:r>
+        <w:rPr>
+          <w:rFonts w:ascii="Consolas" w:hAnsi="Consolas" w:eastAsia="Consolas"/>
+          <w:color w:val="1F1F1F"/>
+          <w:sz w:val="15"/>
+        </w:rPr>
         <w:t>namespace Bai01;</w:t>
       </w:r>
     </w:p>
@@ -2030,6 +2058,34 @@
           <w:color w:val="1F1F1F"/>
           <w:sz w:val="15"/>
         </w:rPr>
+        <w:t>using System;</w:t>
+      </w:r>
+    </w:p>
+    <w:p>
+      <w:pPr>
+        <w:pStyle w:val="CodeBlock"/>
+        <w:keepLines/>
+      </w:pPr>
+      <w:r>
+        <w:rPr>
+          <w:rFonts w:ascii="Consolas" w:hAnsi="Consolas" w:eastAsia="Consolas"/>
+          <w:color w:val="1F1F1F"/>
+          <w:sz w:val="15"/>
+        </w:rPr>
+        <w:t xml:space="preserve"> </w:t>
+      </w:r>
+    </w:p>
+    <w:p>
+      <w:pPr>
+        <w:pStyle w:val="CodeBlock"/>
+        <w:keepLines/>
+      </w:pPr>
+      <w:r>
+        <w:rPr>
+          <w:rFonts w:ascii="Consolas" w:hAnsi="Consolas" w:eastAsia="Consolas"/>
+          <w:color w:val="1F1F1F"/>
+          <w:sz w:val="15"/>
+        </w:rPr>
         <w:t>namespace Bai02;</w:t>
       </w:r>
     </w:p>
@@ -2425,6 +2481,34 @@
           <w:color w:val="1F1F1F"/>
           <w:sz w:val="15"/>
         </w:rPr>
+        <w:t>using System;</w:t>
+      </w:r>
+    </w:p>
+    <w:p>
+      <w:pPr>
+        <w:pStyle w:val="CodeBlock"/>
+        <w:keepLines/>
+      </w:pPr>
+      <w:r>
+        <w:rPr>
+          <w:rFonts w:ascii="Consolas" w:hAnsi="Consolas" w:eastAsia="Consolas"/>
+          <w:color w:val="1F1F1F"/>
+          <w:sz w:val="15"/>
+        </w:rPr>
+        <w:t xml:space="preserve"> </w:t>
+      </w:r>
+    </w:p>
+    <w:p>
+      <w:pPr>
+        <w:pStyle w:val="CodeBlock"/>
+        <w:keepLines/>
+      </w:pPr>
+      <w:r>
+        <w:rPr>
+          <w:rFonts w:ascii="Consolas" w:hAnsi="Consolas" w:eastAsia="Consolas"/>
+          <w:color w:val="1F1F1F"/>
+          <w:sz w:val="15"/>
+        </w:rPr>
         <w:t>namespace Bai03;</w:t>
       </w:r>
     </w:p>
@@ -3002,6 +3086,34 @@
           <w:color w:val="1F1F1F"/>
           <w:sz w:val="15"/>
         </w:rPr>
+        <w:t>using System;</w:t>
+      </w:r>
+    </w:p>
+    <w:p>
+      <w:pPr>
+        <w:pStyle w:val="CodeBlock"/>
+        <w:keepLines/>
+      </w:pPr>
+      <w:r>
+        <w:rPr>
+          <w:rFonts w:ascii="Consolas" w:hAnsi="Consolas" w:eastAsia="Consolas"/>
+          <w:color w:val="1F1F1F"/>
+          <w:sz w:val="15"/>
+        </w:rPr>
+        <w:t xml:space="preserve"> </w:t>
+      </w:r>
+    </w:p>
+    <w:p>
+      <w:pPr>
+        <w:pStyle w:val="CodeBlock"/>
+        <w:keepLines/>
+      </w:pPr>
+      <w:r>
+        <w:rPr>
+          <w:rFonts w:ascii="Consolas" w:hAnsi="Consolas" w:eastAsia="Consolas"/>
+          <w:color w:val="1F1F1F"/>
+          <w:sz w:val="15"/>
+        </w:rPr>
         <w:t>namespace Bai04;</w:t>
       </w:r>
     </w:p>
@@ -3622,6 +3734,34 @@
           <w:sz w:val="24"/>
         </w:rPr>
         <w:t>Mã nguồn</w:t>
+      </w:r>
+    </w:p>
+    <w:p>
+      <w:pPr>
+        <w:pStyle w:val="CodeBlock"/>
+        <w:keepLines/>
+      </w:pPr>
+      <w:r>
+        <w:rPr>
+          <w:rFonts w:ascii="Consolas" w:hAnsi="Consolas" w:eastAsia="Consolas"/>
+          <w:color w:val="1F1F1F"/>
+          <w:sz w:val="15"/>
+        </w:rPr>
+        <w:t>using System;</w:t>
+      </w:r>
+    </w:p>
+    <w:p>
+      <w:pPr>
+        <w:pStyle w:val="CodeBlock"/>
+        <w:keepLines/>
+      </w:pPr>
+      <w:r>
+        <w:rPr>
+          <w:rFonts w:ascii="Consolas" w:hAnsi="Consolas" w:eastAsia="Consolas"/>
+          <w:color w:val="1F1F1F"/>
+          <w:sz w:val="15"/>
+        </w:rPr>
+        <w:t xml:space="preserve"> </w:t>
       </w:r>
     </w:p>
     <w:p>
@@ -5074,6 +5214,34 @@
           <w:color w:val="1F1F1F"/>
           <w:sz w:val="15"/>
         </w:rPr>
+        <w:t>using System;</w:t>
+      </w:r>
+    </w:p>
+    <w:p>
+      <w:pPr>
+        <w:pStyle w:val="CodeBlock"/>
+        <w:keepLines/>
+      </w:pPr>
+      <w:r>
+        <w:rPr>
+          <w:rFonts w:ascii="Consolas" w:hAnsi="Consolas" w:eastAsia="Consolas"/>
+          <w:color w:val="1F1F1F"/>
+          <w:sz w:val="15"/>
+        </w:rPr>
+        <w:t xml:space="preserve"> </w:t>
+      </w:r>
+    </w:p>
+    <w:p>
+      <w:pPr>
+        <w:pStyle w:val="CodeBlock"/>
+        <w:keepLines/>
+      </w:pPr>
+      <w:r>
+        <w:rPr>
+          <w:rFonts w:ascii="Consolas" w:hAnsi="Consolas" w:eastAsia="Consolas"/>
+          <w:color w:val="1F1F1F"/>
+          <w:sz w:val="15"/>
+        </w:rPr>
         <w:t>namespace Bai06;</w:t>
       </w:r>
     </w:p>
@@ -5679,6 +5847,34 @@
           <w:color w:val="1F1F1F"/>
           <w:sz w:val="15"/>
         </w:rPr>
+        <w:t>using System;</w:t>
+      </w:r>
+    </w:p>
+    <w:p>
+      <w:pPr>
+        <w:pStyle w:val="CodeBlock"/>
+        <w:keepLines/>
+      </w:pPr>
+      <w:r>
+        <w:rPr>
+          <w:rFonts w:ascii="Consolas" w:hAnsi="Consolas" w:eastAsia="Consolas"/>
+          <w:color w:val="1F1F1F"/>
+          <w:sz w:val="15"/>
+        </w:rPr>
+        <w:t xml:space="preserve"> </w:t>
+      </w:r>
+    </w:p>
+    <w:p>
+      <w:pPr>
+        <w:pStyle w:val="CodeBlock"/>
+        <w:keepLines/>
+      </w:pPr>
+      <w:r>
+        <w:rPr>
+          <w:rFonts w:ascii="Consolas" w:hAnsi="Consolas" w:eastAsia="Consolas"/>
+          <w:color w:val="1F1F1F"/>
+          <w:sz w:val="15"/>
+        </w:rPr>
         <w:t>namespace Bai07;</w:t>
       </w:r>
     </w:p>
@@ -6285,6 +6481,34 @@
           <w:sz w:val="24"/>
         </w:rPr>
         <w:t>Mã nguồn</w:t>
+      </w:r>
+    </w:p>
+    <w:p>
+      <w:pPr>
+        <w:pStyle w:val="CodeBlock"/>
+        <w:keepLines/>
+      </w:pPr>
+      <w:r>
+        <w:rPr>
+          <w:rFonts w:ascii="Consolas" w:hAnsi="Consolas" w:eastAsia="Consolas"/>
+          <w:color w:val="1F1F1F"/>
+          <w:sz w:val="15"/>
+        </w:rPr>
+        <w:t>using System;</w:t>
+      </w:r>
+    </w:p>
+    <w:p>
+      <w:pPr>
+        <w:pStyle w:val="CodeBlock"/>
+        <w:keepLines/>
+      </w:pPr>
+      <w:r>
+        <w:rPr>
+          <w:rFonts w:ascii="Consolas" w:hAnsi="Consolas" w:eastAsia="Consolas"/>
+          <w:color w:val="1F1F1F"/>
+          <w:sz w:val="15"/>
+        </w:rPr>
+        <w:t xml:space="preserve"> </w:t>
       </w:r>
     </w:p>
     <w:p>
@@ -6905,6 +7129,34 @@
           <w:color w:val="1F1F1F"/>
           <w:sz w:val="15"/>
         </w:rPr>
+        <w:t>using System;</w:t>
+      </w:r>
+    </w:p>
+    <w:p>
+      <w:pPr>
+        <w:pStyle w:val="CodeBlock"/>
+        <w:keepLines/>
+      </w:pPr>
+      <w:r>
+        <w:rPr>
+          <w:rFonts w:ascii="Consolas" w:hAnsi="Consolas" w:eastAsia="Consolas"/>
+          <w:color w:val="1F1F1F"/>
+          <w:sz w:val="15"/>
+        </w:rPr>
+        <w:t xml:space="preserve"> </w:t>
+      </w:r>
+    </w:p>
+    <w:p>
+      <w:pPr>
+        <w:pStyle w:val="CodeBlock"/>
+        <w:keepLines/>
+      </w:pPr>
+      <w:r>
+        <w:rPr>
+          <w:rFonts w:ascii="Consolas" w:hAnsi="Consolas" w:eastAsia="Consolas"/>
+          <w:color w:val="1F1F1F"/>
+          <w:sz w:val="15"/>
+        </w:rPr>
         <w:t>namespace Bai09;</w:t>
       </w:r>
     </w:p>
@@ -7512,6 +7764,34 @@
           <w:color w:val="1F1F1F"/>
           <w:sz w:val="15"/>
         </w:rPr>
+        <w:t>using System;</w:t>
+      </w:r>
+    </w:p>
+    <w:p>
+      <w:pPr>
+        <w:pStyle w:val="CodeBlock"/>
+        <w:keepLines/>
+      </w:pPr>
+      <w:r>
+        <w:rPr>
+          <w:rFonts w:ascii="Consolas" w:hAnsi="Consolas" w:eastAsia="Consolas"/>
+          <w:color w:val="1F1F1F"/>
+          <w:sz w:val="15"/>
+        </w:rPr>
+        <w:t xml:space="preserve"> </w:t>
+      </w:r>
+    </w:p>
+    <w:p>
+      <w:pPr>
+        <w:pStyle w:val="CodeBlock"/>
+        <w:keepLines/>
+      </w:pPr>
+      <w:r>
+        <w:rPr>
+          <w:rFonts w:ascii="Consolas" w:hAnsi="Consolas" w:eastAsia="Consolas"/>
+          <w:color w:val="1F1F1F"/>
+          <w:sz w:val="15"/>
+        </w:rPr>
         <w:t>namespace Bai10;</w:t>
       </w:r>
     </w:p>
@@ -8103,6 +8383,34 @@
           <w:color w:val="1F1F1F"/>
           <w:sz w:val="15"/>
         </w:rPr>
+        <w:t>using System;</w:t>
+      </w:r>
+    </w:p>
+    <w:p>
+      <w:pPr>
+        <w:pStyle w:val="CodeBlock"/>
+        <w:keepLines/>
+      </w:pPr>
+      <w:r>
+        <w:rPr>
+          <w:rFonts w:ascii="Consolas" w:hAnsi="Consolas" w:eastAsia="Consolas"/>
+          <w:color w:val="1F1F1F"/>
+          <w:sz w:val="15"/>
+        </w:rPr>
+        <w:t xml:space="preserve"> </w:t>
+      </w:r>
+    </w:p>
+    <w:p>
+      <w:pPr>
+        <w:pStyle w:val="CodeBlock"/>
+        <w:keepLines/>
+      </w:pPr>
+      <w:r>
+        <w:rPr>
+          <w:rFonts w:ascii="Consolas" w:hAnsi="Consolas" w:eastAsia="Consolas"/>
+          <w:color w:val="1F1F1F"/>
+          <w:sz w:val="15"/>
+        </w:rPr>
         <w:t>namespace Bai11;</w:t>
       </w:r>
     </w:p>
@@ -8541,6 +8849,20 @@
           <w:sz w:val="24"/>
         </w:rPr>
         <w:t>Mã nguồn</w:t>
+      </w:r>
+    </w:p>
+    <w:p>
+      <w:pPr>
+        <w:pStyle w:val="CodeBlock"/>
+        <w:keepLines/>
+      </w:pPr>
+      <w:r>
+        <w:rPr>
+          <w:rFonts w:ascii="Consolas" w:hAnsi="Consolas" w:eastAsia="Consolas"/>
+          <w:color w:val="1F1F1F"/>
+          <w:sz w:val="15"/>
+        </w:rPr>
+        <w:t>using System;</w:t>
       </w:r>
     </w:p>
     <w:p>
@@ -9066,6 +9388,34 @@
           <w:sz w:val="24"/>
         </w:rPr>
         <w:t>Mã nguồn</w:t>
+      </w:r>
+    </w:p>
+    <w:p>
+      <w:pPr>
+        <w:pStyle w:val="CodeBlock"/>
+        <w:keepLines/>
+      </w:pPr>
+      <w:r>
+        <w:rPr>
+          <w:rFonts w:ascii="Consolas" w:hAnsi="Consolas" w:eastAsia="Consolas"/>
+          <w:color w:val="1F1F1F"/>
+          <w:sz w:val="15"/>
+        </w:rPr>
+        <w:t>using System;</w:t>
+      </w:r>
+    </w:p>
+    <w:p>
+      <w:pPr>
+        <w:pStyle w:val="CodeBlock"/>
+        <w:keepLines/>
+      </w:pPr>
+      <w:r>
+        <w:rPr>
+          <w:rFonts w:ascii="Consolas" w:hAnsi="Consolas" w:eastAsia="Consolas"/>
+          <w:color w:val="1F1F1F"/>
+          <w:sz w:val="15"/>
+        </w:rPr>
+        <w:t xml:space="preserve"> </w:t>
       </w:r>
     </w:p>
     <w:p>
@@ -10044,6 +10394,34 @@
           <w:color w:val="1F1F1F"/>
           <w:sz w:val="15"/>
         </w:rPr>
+        <w:t>using System;</w:t>
+      </w:r>
+    </w:p>
+    <w:p>
+      <w:pPr>
+        <w:pStyle w:val="CodeBlock"/>
+        <w:keepLines/>
+      </w:pPr>
+      <w:r>
+        <w:rPr>
+          <w:rFonts w:ascii="Consolas" w:hAnsi="Consolas" w:eastAsia="Consolas"/>
+          <w:color w:val="1F1F1F"/>
+          <w:sz w:val="15"/>
+        </w:rPr>
+        <w:t xml:space="preserve"> </w:t>
+      </w:r>
+    </w:p>
+    <w:p>
+      <w:pPr>
+        <w:pStyle w:val="CodeBlock"/>
+        <w:keepLines/>
+      </w:pPr>
+      <w:r>
+        <w:rPr>
+          <w:rFonts w:ascii="Consolas" w:hAnsi="Consolas" w:eastAsia="Consolas"/>
+          <w:color w:val="1F1F1F"/>
+          <w:sz w:val="15"/>
+        </w:rPr>
         <w:t>namespace Bai14;</w:t>
       </w:r>
     </w:p>
@@ -10944,6 +11322,48 @@
           <w:sz w:val="24"/>
         </w:rPr>
         <w:t>Mã nguồn</w:t>
+      </w:r>
+    </w:p>
+    <w:p>
+      <w:pPr>
+        <w:pStyle w:val="CodeBlock"/>
+        <w:keepLines/>
+      </w:pPr>
+      <w:r>
+        <w:rPr>
+          <w:rFonts w:ascii="Consolas" w:hAnsi="Consolas" w:eastAsia="Consolas"/>
+          <w:color w:val="1F1F1F"/>
+          <w:sz w:val="15"/>
+        </w:rPr>
+        <w:t>using System;</w:t>
+      </w:r>
+    </w:p>
+    <w:p>
+      <w:pPr>
+        <w:pStyle w:val="CodeBlock"/>
+        <w:keepLines/>
+      </w:pPr>
+      <w:r>
+        <w:rPr>
+          <w:rFonts w:ascii="Consolas" w:hAnsi="Consolas" w:eastAsia="Consolas"/>
+          <w:color w:val="1F1F1F"/>
+          <w:sz w:val="15"/>
+        </w:rPr>
+        <w:t>using System.Collections.Generic;</w:t>
+      </w:r>
+    </w:p>
+    <w:p>
+      <w:pPr>
+        <w:pStyle w:val="CodeBlock"/>
+        <w:keepLines/>
+      </w:pPr>
+      <w:r>
+        <w:rPr>
+          <w:rFonts w:ascii="Consolas" w:hAnsi="Consolas" w:eastAsia="Consolas"/>
+          <w:color w:val="1F1F1F"/>
+          <w:sz w:val="15"/>
+        </w:rPr>
+        <w:t xml:space="preserve"> </w:t>
       </w:r>
     </w:p>
     <w:p>
@@ -12226,6 +12646,20 @@
           <w:color w:val="1F1F1F"/>
           <w:sz w:val="15"/>
         </w:rPr>
+        <w:t>using System;</w:t>
+      </w:r>
+    </w:p>
+    <w:p>
+      <w:pPr>
+        <w:pStyle w:val="CodeBlock"/>
+        <w:keepLines/>
+      </w:pPr>
+      <w:r>
+        <w:rPr>
+          <w:rFonts w:ascii="Consolas" w:hAnsi="Consolas" w:eastAsia="Consolas"/>
+          <w:color w:val="1F1F1F"/>
+          <w:sz w:val="15"/>
+        </w:rPr>
         <w:t>using System.Globalization;</w:t>
       </w:r>
     </w:p>
@@ -13118,6 +13552,48 @@
           <w:sz w:val="24"/>
         </w:rPr>
         <w:t>Mã nguồn</w:t>
+      </w:r>
+    </w:p>
+    <w:p>
+      <w:pPr>
+        <w:pStyle w:val="CodeBlock"/>
+        <w:keepLines/>
+      </w:pPr>
+      <w:r>
+        <w:rPr>
+          <w:rFonts w:ascii="Consolas" w:hAnsi="Consolas" w:eastAsia="Consolas"/>
+          <w:color w:val="1F1F1F"/>
+          <w:sz w:val="15"/>
+        </w:rPr>
+        <w:t>using System;</w:t>
+      </w:r>
+    </w:p>
+    <w:p>
+      <w:pPr>
+        <w:pStyle w:val="CodeBlock"/>
+        <w:keepLines/>
+      </w:pPr>
+      <w:r>
+        <w:rPr>
+          <w:rFonts w:ascii="Consolas" w:hAnsi="Consolas" w:eastAsia="Consolas"/>
+          <w:color w:val="1F1F1F"/>
+          <w:sz w:val="15"/>
+        </w:rPr>
+        <w:t>using System.Collections.Generic;</w:t>
+      </w:r>
+    </w:p>
+    <w:p>
+      <w:pPr>
+        <w:pStyle w:val="CodeBlock"/>
+        <w:keepLines/>
+      </w:pPr>
+      <w:r>
+        <w:rPr>
+          <w:rFonts w:ascii="Consolas" w:hAnsi="Consolas" w:eastAsia="Consolas"/>
+          <w:color w:val="1F1F1F"/>
+          <w:sz w:val="15"/>
+        </w:rPr>
+        <w:t xml:space="preserve"> </w:t>
       </w:r>
     </w:p>
     <w:p>

</xml_diff>